<commit_message>
updated upto PNP section
</commit_message>
<xml_diff>
--- a/notes_furbished/LRMechSection.docx
+++ b/notes_furbished/LRMechSection.docx
@@ -14,7 +14,23 @@
         </w:pBdr>
       </w:pPr>
       <w:r>
-        <w:t>Section InCharge: Mr. Moshiur, SSAE</w:t>
+        <w:t xml:space="preserve">Section </w:t>
+      </w:r>
+      <w:proofErr w:type="spellStart"/>
+      <w:r>
+        <w:t>InCharge</w:t>
+      </w:r>
+      <w:proofErr w:type="spellEnd"/>
+      <w:r>
+        <w:t xml:space="preserve">: Mr. </w:t>
+      </w:r>
+      <w:proofErr w:type="spellStart"/>
+      <w:r>
+        <w:t>Moshiur</w:t>
+      </w:r>
+      <w:proofErr w:type="spellEnd"/>
+      <w:r>
+        <w:t>, SSAE</w:t>
       </w:r>
     </w:p>
     <w:p/>
@@ -80,7 +96,13 @@
         </w:numPr>
       </w:pPr>
       <w:r>
-        <w:t>Sends information down to the PNP (Planning and ?) section (@CEX administration building)</w:t>
+        <w:t xml:space="preserve">Sends information down to the PNP (Planning and </w:t>
+      </w:r>
+      <w:r>
+        <w:t>Progress</w:t>
+      </w:r>
+      <w:r>
+        <w:t>) section (@CEX administration building)</w:t>
       </w:r>
     </w:p>
     <w:p>
@@ -313,6 +335,67 @@
     <w:p/>
     <w:p>
       <w:r>
+        <w:rPr>
+          <w:noProof/>
+        </w:rPr>
+        <w:drawing>
+          <wp:anchor distT="0" distB="0" distL="114300" distR="114300" simplePos="0" relativeHeight="251658240" behindDoc="0" locked="0" layoutInCell="1" allowOverlap="1" wp14:anchorId="0AE3BAB0" wp14:editId="150457AA">
+            <wp:simplePos x="0" y="0"/>
+            <wp:positionH relativeFrom="column">
+              <wp:posOffset>1638300</wp:posOffset>
+            </wp:positionH>
+            <wp:positionV relativeFrom="paragraph">
+              <wp:posOffset>883285</wp:posOffset>
+            </wp:positionV>
+            <wp:extent cx="3101975" cy="2324100"/>
+            <wp:effectExtent l="0" t="0" r="3175" b="0"/>
+            <wp:wrapTopAndBottom/>
+            <wp:docPr id="136634025" name="Picture 1"/>
+            <wp:cNvGraphicFramePr>
+              <a:graphicFrameLocks xmlns:a="http://schemas.openxmlformats.org/drawingml/2006/main" noChangeAspect="1"/>
+            </wp:cNvGraphicFramePr>
+            <a:graphic xmlns:a="http://schemas.openxmlformats.org/drawingml/2006/main">
+              <a:graphicData uri="http://schemas.openxmlformats.org/drawingml/2006/picture">
+                <pic:pic xmlns:pic="http://schemas.openxmlformats.org/drawingml/2006/picture">
+                  <pic:nvPicPr>
+                    <pic:cNvPr id="0" name="Picture 2"/>
+                    <pic:cNvPicPr>
+                      <a:picLocks noChangeAspect="1" noChangeArrowheads="1"/>
+                    </pic:cNvPicPr>
+                  </pic:nvPicPr>
+                  <pic:blipFill>
+                    <a:blip r:embed="rId10" cstate="print">
+                      <a:extLst>
+                        <a:ext uri="{28A0092B-C50C-407E-A947-70E740481C1C}">
+                          <a14:useLocalDpi xmlns:a14="http://schemas.microsoft.com/office/drawing/2010/main" val="0"/>
+                        </a:ext>
+                      </a:extLst>
+                    </a:blip>
+                    <a:srcRect/>
+                    <a:stretch>
+                      <a:fillRect/>
+                    </a:stretch>
+                  </pic:blipFill>
+                  <pic:spPr bwMode="auto">
+                    <a:xfrm>
+                      <a:off x="0" y="0"/>
+                      <a:ext cx="3101975" cy="2324100"/>
+                    </a:xfrm>
+                    <a:prstGeom prst="rect">
+                      <a:avLst/>
+                    </a:prstGeom>
+                    <a:noFill/>
+                    <a:ln>
+                      <a:noFill/>
+                    </a:ln>
+                  </pic:spPr>
+                </pic:pic>
+              </a:graphicData>
+            </a:graphic>
+          </wp:anchor>
+        </w:drawing>
+      </w:r>
+      <w:r>
         <w:t>After all the components comes back after repairing to this section, it reassembles all parts into a fully fitted locomotive again. Important works done during this period include:</w:t>
       </w:r>
     </w:p>
@@ -326,14 +409,6 @@
       </w:pPr>
       <w:r>
         <w:t>Engine-compressor and engine-alternator shaft coupling alignment</w:t>
-      </w:r>
-    </w:p>
-    <w:p>
-      <w:pPr>
-        <w:pStyle w:val="ListParagraph"/>
-      </w:pPr>
-      <w:r>
-        <w:t>(alignment er ekta chobi tulte hobe)</w:t>
       </w:r>
     </w:p>
     <w:p>
@@ -373,7 +448,7 @@
                     <pic:cNvPicPr/>
                   </pic:nvPicPr>
                   <pic:blipFill>
-                    <a:blip r:embed="rId10"/>
+                    <a:blip r:embed="rId11"/>
                     <a:stretch>
                       <a:fillRect/>
                     </a:stretch>
@@ -457,6 +532,7 @@
     <w:p/>
     <w:p>
       <w:r>
+        <w:lastRenderedPageBreak/>
         <w:t>If everything alright, then the locomotive is let to run 24hrs (intermittently, 8 hrs daily, 3 days) -&gt; process is called lapping.</w:t>
       </w:r>
     </w:p>
@@ -521,8 +597,15 @@
     </w:p>
     <w:p>
       <w:r>
-        <w:lastRenderedPageBreak/>
-        <w:t>Then light trial (ie, without load) run.</w:t>
+        <w:t>Then light trial (</w:t>
+      </w:r>
+      <w:proofErr w:type="spellStart"/>
+      <w:r>
+        <w:t>ie</w:t>
+      </w:r>
+      <w:proofErr w:type="spellEnd"/>
+      <w:r>
+        <w:t>, without load) run.</w:t>
       </w:r>
     </w:p>
     <w:p>
@@ -558,7 +641,7 @@
       <w:r>
         <w:t>(</w:t>
       </w:r>
-      <w:hyperlink r:id="rId11" w:history="1">
+      <w:hyperlink r:id="rId12" w:history="1">
         <w:r>
           <w:rPr>
             <w:rStyle w:val="Hyperlink"/>

</xml_diff>